<commit_message>
Add inventor names, affiliations and ORCIDs to patent draft (Dawale, Chaudhari, Dhakne)
</commit_message>
<xml_diff>
--- a/paper/final paper and draft/Patent_Draft_ACE_System (3).docx
+++ b/paper/final paper and draft/Patent_Draft_ACE_System (3).docx
@@ -25,6 +25,37 @@
           <w:color w:val="000000"/>
         </w:rPr>
         <w:t>1. Full name, nationality and address of applicant(s):</w:t>
+      </w:r>
+      <w:r>
+        <w:rPr>
+          <w:sz w:val="22"/>
+        </w:rPr>
+        <w:br/>
+        <w:t>Applicant 1: Vyankatesh Dattatray Dawale</w:t>
+        <w:br/>
+        <w:t>Nationality: Indian</w:t>
+        <w:br/>
+        <w:t>Address: Dept. of Computer Science and Engineering, Vishwakarma University, Pune, India</w:t>
+        <w:br/>
+        <w:t>ORCID: 0009-0008-8773-9604</w:t>
+        <w:br/>
+        <w:br/>
+        <w:t>Applicant 2: Pratyush Kunal Chaudhari</w:t>
+        <w:br/>
+        <w:t>Nationality: Indian</w:t>
+        <w:br/>
+        <w:t>Address: Dept. of Computer Science and Engineering, Vishwakarma University, Pune, India</w:t>
+        <w:br/>
+        <w:t>ORCID: 0009-0001-8815-7779</w:t>
+        <w:br/>
+        <w:br/>
+        <w:t>Applicant 3: Atharva Namdeo Dhakne</w:t>
+        <w:br/>
+        <w:t>Nationality: Indian</w:t>
+        <w:br/>
+        <w:t>Address: Dept. of Computer Science and Engineering, Vishwakarma University, Pune, India</w:t>
+        <w:br/>
+        <w:t>ORCID: 0009-0006-8357-8335</w:t>
       </w:r>
     </w:p>
     <w:tbl>
@@ -165,6 +196,37 @@
           <w:color w:val="000000"/>
         </w:rPr>
         <w:t>2. Full name, nationality, address, mail id, and phone number of inventor(s):</w:t>
+      </w:r>
+      <w:r>
+        <w:rPr>
+          <w:sz w:val="22"/>
+        </w:rPr>
+        <w:br/>
+        <w:t>Inventor 1: Vyankatesh Dattatray Dawale</w:t>
+        <w:br/>
+        <w:t>Nationality: Indian</w:t>
+        <w:br/>
+        <w:t>Address: Dept. of Computer Science and Engineering, Vishwakarma University, Pune, India</w:t>
+        <w:br/>
+        <w:t>ORCID: 0009-0008-8773-9604</w:t>
+        <w:br/>
+        <w:br/>
+        <w:t>Inventor 2: Pratyush Kunal Chaudhari</w:t>
+        <w:br/>
+        <w:t>Nationality: Indian</w:t>
+        <w:br/>
+        <w:t>Address: Dept. of Computer Science and Engineering, Vishwakarma University, Pune, India</w:t>
+        <w:br/>
+        <w:t>ORCID: 0009-0001-8815-7779</w:t>
+        <w:br/>
+        <w:br/>
+        <w:t>Inventor 3: Atharva Namdeo Dhakne</w:t>
+        <w:br/>
+        <w:t>Nationality: Indian</w:t>
+        <w:br/>
+        <w:t>Address: Dept. of Computer Science and Engineering, Vishwakarma University, Pune, India</w:t>
+        <w:br/>
+        <w:t>ORCID: 0009-0006-8357-8335</w:t>
       </w:r>
     </w:p>
     <w:tbl>
@@ -525,6 +587,18 @@
         </w:rPr>
         <w:br/>
         <w:t>Signatures of all inventors:</w:t>
+      </w:r>
+      <w:r>
+        <w:rPr>
+          <w:sz w:val="22"/>
+        </w:rPr>
+        <w:br/>
+        <w:br/>
+        <w:t>Inventor 1: Vyankatesh Dattatray Dawale  ___________________________</w:t>
+        <w:br/>
+        <w:t>Inventor 2: Pratyush Kunal Chaudhari  ___________________________</w:t>
+        <w:br/>
+        <w:t>Inventor 3: Atharva Namdeo Dhakne  ___________________________</w:t>
       </w:r>
     </w:p>
     <w:tbl>

</xml_diff>